<commit_message>
fixed the accessibility statement in word
</commit_message>
<xml_diff>
--- a/crochet-curio/assets/patterns/rosie-beanie-pattern-hi.docx
+++ b/crochet-curio/assets/patterns/rosie-beanie-pattern-hi.docx
@@ -106,22 +106,6 @@
         <w:rPr>
           <w:lang w:val="hi-IN" w:bidi="hi-IN"/>
         </w:rPr>
-        <w:t xml:space="preserve">टाइप का साइज़ आपके हाथ में है: ब्राउज़र में कंट्रोल और +, वर्ड फ़ाइल में वर्ड का ज़ूम। दोनों में टेक्स्ट अपने आप दोबारा सज जाता है।</w:t>
-      </w:r>
-    </w:p>
-    <w:p>
-      <w:pPr>
-        <w:pStyle w:val="ListParagraph"/>
-        <w:numPr>
-          <w:ilvl w:val="0"/>
-          <w:numId w:val="2"/>
-        </w:numPr>
-        <w:spacing w:after="120"/>
-      </w:pPr>
-      <w:r>
-        <w:rPr>
-          <w:lang w:val="hi-IN" w:bidi="hi-IN"/>
-        </w:rPr>
         <w:t xml:space="preserve">कहीं भी इटैलिक अक्षर इस्तेमाल नहीं किए गए हैं।</w:t>
       </w:r>
     </w:p>
@@ -254,7 +238,7 @@
         </w:rPr>
         <w:t xml:space="preserve">अगर इस पैटर्न में कुछ गलत है, समझ से बाहर है, या आपके स्क्रीन रीडर पर ठीक से नहीं पढ़ा जाता, तो कृपया </w:t>
       </w:r>
-      <w:hyperlink w:history="1" r:id="rIdrppbom8cri4gytwv6q_k3">
+      <w:hyperlink w:history="1" r:id="rIdcbfcsnj8vfud0o-ablrcp">
         <w:r>
           <w:rPr>
             <w:rStyle w:val="Hyperlink"/>

</xml_diff>